<commit_message>
Matlab 11, 12 and 13 labs
</commit_message>
<xml_diff>
--- a/digital-modeling/9 Лаба/Отчет.docx
+++ b/digital-modeling/9 Лаба/Отчет.docx
@@ -1089,6 +1089,7 @@
       </w:pPr>
       <w:r>
         <w:rPr>
+          <w:noProof/>
           <w:lang w:val="en-US"/>
         </w:rPr>
         <w:drawing>
@@ -1140,66 +1141,319 @@
         </w:rPr>
         <w:br w:type="page"/>
       </w:r>
+    </w:p>
+    <w:p>
+      <w:pPr>
+        <w:spacing w:line="240" w:lineRule="auto"/>
+        <w:rPr>
+          <w:rFonts w:eastAsiaTheme="minorEastAsia"/>
+        </w:rPr>
+      </w:pPr>
       <w:r>
         <w:rPr>
           <w:rFonts w:eastAsiaTheme="minorEastAsia"/>
         </w:rPr>
         <w:lastRenderedPageBreak/>
-        <w:t>Э</w:t>
-      </w:r>
-      <w:r>
-        <w:rPr>
-          <w:rFonts w:eastAsiaTheme="minorEastAsia"/>
-        </w:rPr>
-        <w:t>лектронная/</w:t>
-      </w:r>
-      <w:r>
+        <w:t>На основе проведённого расчёта ORCA для молекулы</w:t>
+      </w:r>
+      <w:r>
+        <w:rPr>
+          <w:rFonts w:eastAsiaTheme="minorEastAsia"/>
+        </w:rPr>
+        <w:t xml:space="preserve"> </w:t>
+      </w:r>
+      <w:r>
+        <w:rPr>
+          <w:rFonts w:eastAsiaTheme="minorEastAsia"/>
+        </w:rPr>
+        <w:t xml:space="preserve">1H-1,2,3-триазол (метод BLYP/def2-TZVP, D3BJ, </w:t>
+      </w:r>
+      <w:proofErr w:type="gramStart"/>
+      <w:r>
+        <w:rPr>
+          <w:rFonts w:eastAsiaTheme="minorEastAsia"/>
+        </w:rPr>
+        <w:t>CPCM(</w:t>
+      </w:r>
+      <w:proofErr w:type="gramEnd"/>
+      <w:r>
+        <w:rPr>
+          <w:rFonts w:eastAsiaTheme="minorEastAsia"/>
+        </w:rPr>
+        <w:t>вода)) получены следующие значения:</w:t>
+      </w:r>
+    </w:p>
+    <w:p>
+      <w:pPr>
+        <w:spacing w:line="240" w:lineRule="auto"/>
+        <w:rPr>
+          <w:rFonts w:eastAsiaTheme="minorEastAsia"/>
+        </w:rPr>
+      </w:pPr>
+    </w:p>
+    <w:p>
+      <w:pPr>
+        <w:spacing w:line="240" w:lineRule="auto"/>
         <w:rPr>
           <w:rFonts w:eastAsiaTheme="minorEastAsia"/>
           <w:lang w:val="en-US"/>
         </w:rPr>
-        <w:t>SCF</w:t>
-      </w:r>
-      <w:r>
-        <w:rPr>
-          <w:rFonts w:eastAsiaTheme="minorEastAsia"/>
-        </w:rPr>
-        <w:t xml:space="preserve"> энергия равна</w:t>
-      </w:r>
-      <w:r>
+      </w:pPr>
+      <w:r>
+        <w:rPr>
+          <w:rFonts w:eastAsiaTheme="minorEastAsia"/>
+        </w:rPr>
+        <w:t>Результаты расчёта</w:t>
+      </w:r>
+    </w:p>
+    <w:p>
+      <w:pPr>
+        <w:spacing w:line="240" w:lineRule="auto"/>
+        <w:rPr>
+          <w:rFonts w:eastAsiaTheme="minorEastAsia"/>
+        </w:rPr>
+      </w:pPr>
+    </w:p>
+    <w:p>
+      <w:pPr>
+        <w:spacing w:line="240" w:lineRule="auto"/>
         <w:rPr>
           <w:rFonts w:eastAsiaTheme="minorEastAsia"/>
           <w:lang w:val="en-US"/>
         </w:rPr>
-        <w:t> </w:t>
-      </w:r>
-      <w:r>
-        <w:rPr>
-          <w:rFonts w:eastAsiaTheme="minorEastAsia"/>
-        </w:rPr>
-        <w:t xml:space="preserve">-241.798427508914 </w:t>
+      </w:pPr>
+      <w:r>
+        <w:rPr>
+          <w:rFonts w:eastAsiaTheme="minorEastAsia"/>
+        </w:rPr>
+        <w:t>Полная</w:t>
       </w:r>
       <w:r>
         <w:rPr>
           <w:rFonts w:eastAsiaTheme="minorEastAsia"/>
           <w:lang w:val="en-US"/>
         </w:rPr>
+        <w:t xml:space="preserve"> </w:t>
+      </w:r>
+      <w:r>
+        <w:rPr>
+          <w:rFonts w:eastAsiaTheme="minorEastAsia"/>
+        </w:rPr>
+        <w:t>энергия</w:t>
+      </w:r>
+      <w:r>
+        <w:rPr>
+          <w:rFonts w:eastAsiaTheme="minorEastAsia"/>
+          <w:lang w:val="en-US"/>
+        </w:rPr>
+        <w:t xml:space="preserve"> (Final single point energy):</w:t>
+      </w:r>
+    </w:p>
+    <w:p>
+      <w:pPr>
+        <w:spacing w:line="240" w:lineRule="auto"/>
+        <w:rPr>
+          <w:rFonts w:eastAsiaTheme="minorEastAsia"/>
+          <w:lang w:val="en-US"/>
+        </w:rPr>
+      </w:pPr>
+      <w:r>
+        <w:rPr>
+          <w:rFonts w:eastAsiaTheme="minorEastAsia"/>
+          <w:lang w:val="en-US"/>
+        </w:rPr>
+        <w:t>-</w:t>
+      </w:r>
+      <w:r>
+        <w:rPr>
+          <w:rFonts w:eastAsiaTheme="minorEastAsia"/>
+        </w:rPr>
+        <w:t xml:space="preserve">242.121159371906 </w:t>
+      </w:r>
+      <w:proofErr w:type="spellStart"/>
+      <w:r>
+        <w:rPr>
+          <w:rFonts w:eastAsiaTheme="minorEastAsia"/>
+        </w:rPr>
         <w:t>Eh</w:t>
       </w:r>
-      <w:r>
-        <w:rPr>
-          <w:rFonts w:eastAsiaTheme="minorEastAsia"/>
-        </w:rPr>
-        <w:t xml:space="preserve">, </w:t>
+      <w:proofErr w:type="spellEnd"/>
+    </w:p>
+    <w:p>
+      <w:pPr>
+        <w:spacing w:line="240" w:lineRule="auto"/>
+        <w:rPr>
+          <w:rFonts w:eastAsiaTheme="minorEastAsia"/>
+        </w:rPr>
+      </w:pPr>
+    </w:p>
+    <w:p>
+      <w:pPr>
+        <w:spacing w:line="240" w:lineRule="auto"/>
+        <w:rPr>
+          <w:rFonts w:eastAsiaTheme="minorEastAsia"/>
+          <w:lang w:val="en-US"/>
+        </w:rPr>
+      </w:pPr>
+      <w:r>
+        <w:rPr>
+          <w:rFonts w:eastAsiaTheme="minorEastAsia"/>
+        </w:rPr>
+        <w:t>Энергия</w:t>
+      </w:r>
+      <w:r>
+        <w:rPr>
+          <w:rFonts w:eastAsiaTheme="minorEastAsia"/>
+          <w:lang w:val="en-US"/>
+        </w:rPr>
+        <w:t xml:space="preserve"> </w:t>
+      </w:r>
+      <w:r>
+        <w:rPr>
+          <w:rFonts w:eastAsiaTheme="minorEastAsia"/>
+        </w:rPr>
+        <w:t>Гиббса</w:t>
+      </w:r>
+      <w:r>
+        <w:rPr>
+          <w:rFonts w:eastAsiaTheme="minorEastAsia"/>
+          <w:lang w:val="en-US"/>
+        </w:rPr>
+        <w:t xml:space="preserve"> (Gibbs free energy) </w:t>
+      </w:r>
+      <w:r>
+        <w:rPr>
+          <w:rFonts w:eastAsiaTheme="minorEastAsia"/>
+        </w:rPr>
+        <w:t>при</w:t>
+      </w:r>
+      <w:r>
+        <w:rPr>
+          <w:rFonts w:eastAsiaTheme="minorEastAsia"/>
+          <w:lang w:val="en-US"/>
+        </w:rPr>
+        <w:t xml:space="preserve"> 298.15 K:</w:t>
+      </w:r>
+    </w:p>
+    <w:p>
+      <w:pPr>
+        <w:spacing w:line="240" w:lineRule="auto"/>
+        <w:rPr>
+          <w:rFonts w:eastAsiaTheme="minorEastAsia"/>
+          <w:lang w:val="en-US"/>
+        </w:rPr>
+      </w:pPr>
+      <w:r>
+        <w:rPr>
+          <w:rFonts w:eastAsiaTheme="minorEastAsia"/>
+          <w:lang w:val="en-US"/>
+        </w:rPr>
+        <w:t>-</w:t>
+      </w:r>
+      <w:r>
+        <w:rPr>
+          <w:rFonts w:eastAsiaTheme="minorEastAsia"/>
+        </w:rPr>
+        <w:t xml:space="preserve">242.09431930 </w:t>
       </w:r>
       <w:proofErr w:type="spellStart"/>
       <w:r>
         <w:rPr>
           <w:rFonts w:eastAsiaTheme="minorEastAsia"/>
         </w:rPr>
-        <w:t>термокорректированная</w:t>
+        <w:t>Eh</w:t>
       </w:r>
       <w:proofErr w:type="spellEnd"/>
+    </w:p>
+    <w:p>
+      <w:pPr>
+        <w:spacing w:line="240" w:lineRule="auto"/>
+        <w:rPr>
+          <w:rFonts w:eastAsiaTheme="minorEastAsia"/>
+        </w:rPr>
+      </w:pPr>
+    </w:p>
+    <w:p>
+      <w:pPr>
+        <w:spacing w:line="240" w:lineRule="auto"/>
+        <w:rPr>
+          <w:rFonts w:eastAsiaTheme="minorEastAsia"/>
+          <w:lang w:val="en-US"/>
+        </w:rPr>
+      </w:pPr>
+      <w:r>
+        <w:rPr>
+          <w:rFonts w:eastAsiaTheme="minorEastAsia"/>
+        </w:rPr>
+        <w:t>Анализ оптимизации и устойчивости</w:t>
+      </w:r>
+    </w:p>
+    <w:p>
+      <w:pPr>
+        <w:spacing w:line="240" w:lineRule="auto"/>
+        <w:rPr>
+          <w:rFonts w:eastAsiaTheme="minorEastAsia"/>
+        </w:rPr>
+      </w:pPr>
+    </w:p>
+    <w:p>
+      <w:pPr>
+        <w:spacing w:line="240" w:lineRule="auto"/>
+        <w:rPr>
+          <w:rFonts w:eastAsiaTheme="minorEastAsia"/>
+          <w:lang w:val="en-US"/>
+        </w:rPr>
+      </w:pPr>
+      <w:r>
+        <w:rPr>
+          <w:rFonts w:eastAsiaTheme="minorEastAsia"/>
+        </w:rPr>
+        <w:t>Оптимизация геометрии сошлась за 43 цикла</w:t>
+      </w:r>
+    </w:p>
+    <w:p>
+      <w:pPr>
+        <w:spacing w:line="240" w:lineRule="auto"/>
+        <w:rPr>
+          <w:rFonts w:eastAsiaTheme="minorEastAsia"/>
+        </w:rPr>
+      </w:pPr>
+    </w:p>
+    <w:p>
+      <w:pPr>
+        <w:spacing w:line="240" w:lineRule="auto"/>
+        <w:rPr>
+          <w:rFonts w:eastAsiaTheme="minorEastAsia"/>
+        </w:rPr>
+      </w:pPr>
+      <w:r>
+        <w:rPr>
+          <w:rFonts w:eastAsiaTheme="minorEastAsia"/>
+        </w:rPr>
+        <w:t>Главным доказательством того, что найдена устойчивая структура, является расчёт частот колебаний в конце оптимизации. После выхода на минимум энергии все колебательные частоты имеют положительные значения.</w:t>
+      </w:r>
+    </w:p>
+    <w:p>
+      <w:pPr>
+        <w:spacing w:line="240" w:lineRule="auto"/>
+        <w:rPr>
+          <w:rFonts w:eastAsiaTheme="minorEastAsia"/>
+        </w:rPr>
+      </w:pPr>
+    </w:p>
+    <w:p>
+      <w:pPr>
+        <w:spacing w:line="240" w:lineRule="auto"/>
+        <w:rPr>
+          <w:rFonts w:eastAsiaTheme="minorEastAsia"/>
+        </w:rPr>
+      </w:pPr>
+      <w:r>
+        <w:rPr>
+          <w:rFonts w:eastAsiaTheme="minorEastAsia"/>
+        </w:rPr>
+        <w:t>Итоговые</w:t>
+      </w:r>
       <w:r>
         <w:rPr>
           <w:rFonts w:eastAsiaTheme="minorEastAsia"/>
@@ -1210,647 +1464,351 @@
         <w:rPr>
           <w:rFonts w:eastAsiaTheme="minorEastAsia"/>
         </w:rPr>
-        <w:t xml:space="preserve">при 298.15 </w:t>
-      </w:r>
-      <w:r>
+        <w:t>частоты</w:t>
+      </w:r>
+      <w:r>
+        <w:rPr>
+          <w:rFonts w:eastAsiaTheme="minorEastAsia"/>
+        </w:rPr>
+        <w:t>:</w:t>
+      </w:r>
+    </w:p>
+    <w:p>
+      <w:pPr>
+        <w:pStyle w:val="a7"/>
+        <w:numPr>
+          <w:ilvl w:val="0"/>
+          <w:numId w:val="11"/>
+        </w:numPr>
+        <w:spacing w:line="240" w:lineRule="auto"/>
+        <w:rPr>
+          <w:rFonts w:eastAsiaTheme="minorEastAsia"/>
+        </w:rPr>
+      </w:pPr>
+      <w:r>
+        <w:rPr>
+          <w:rFonts w:eastAsiaTheme="minorEastAsia"/>
+        </w:rPr>
+        <w:t>Первые 6 мод (</w:t>
+      </w:r>
+      <w:proofErr w:type="gramStart"/>
+      <w:r>
+        <w:rPr>
+          <w:rFonts w:eastAsiaTheme="minorEastAsia"/>
+        </w:rPr>
+        <w:t>0-5</w:t>
+      </w:r>
+      <w:proofErr w:type="gramEnd"/>
+      <w:r>
+        <w:rPr>
+          <w:rFonts w:eastAsiaTheme="minorEastAsia"/>
+        </w:rPr>
+        <w:t>) — нулевые (соответствуют поступательным и вращательным степеням свободы).</w:t>
+      </w:r>
+    </w:p>
+    <w:p>
+      <w:pPr>
+        <w:pStyle w:val="a7"/>
+        <w:numPr>
+          <w:ilvl w:val="0"/>
+          <w:numId w:val="11"/>
+        </w:numPr>
+        <w:spacing w:line="240" w:lineRule="auto"/>
+        <w:rPr>
+          <w:rFonts w:eastAsiaTheme="minorEastAsia"/>
+        </w:rPr>
+      </w:pPr>
+      <w:r>
+        <w:rPr>
+          <w:rFonts w:eastAsiaTheme="minorEastAsia"/>
+        </w:rPr>
+        <w:t>Мода 6 и выше — все положительные. (Например: 152.67, 257.78, 390.50 см</w:t>
+      </w:r>
+      <w:r>
+        <w:rPr>
+          <w:rFonts w:ascii="Cambria Math" w:eastAsiaTheme="minorEastAsia" w:hAnsi="Cambria Math" w:cs="Cambria Math"/>
+        </w:rPr>
+        <w:t>⁻</w:t>
+      </w:r>
+      <w:r>
+        <w:rPr>
+          <w:rFonts w:ascii="Aptos" w:eastAsiaTheme="minorEastAsia" w:hAnsi="Aptos" w:cs="Aptos"/>
+        </w:rPr>
+        <w:t>¹</w:t>
+      </w:r>
+      <w:r>
+        <w:rPr>
+          <w:rFonts w:eastAsiaTheme="minorEastAsia"/>
+        </w:rPr>
+        <w:t xml:space="preserve"> </w:t>
+      </w:r>
+      <w:r>
+        <w:rPr>
+          <w:rFonts w:ascii="Aptos" w:eastAsiaTheme="minorEastAsia" w:hAnsi="Aptos" w:cs="Aptos"/>
+        </w:rPr>
+        <w:t>и</w:t>
+      </w:r>
+      <w:r>
+        <w:rPr>
+          <w:rFonts w:eastAsiaTheme="minorEastAsia"/>
+        </w:rPr>
+        <w:t xml:space="preserve"> </w:t>
+      </w:r>
+      <w:proofErr w:type="gramStart"/>
+      <w:r>
+        <w:rPr>
+          <w:rFonts w:ascii="Aptos" w:eastAsiaTheme="minorEastAsia" w:hAnsi="Aptos" w:cs="Aptos"/>
+        </w:rPr>
+        <w:t>т</w:t>
+      </w:r>
+      <w:r>
+        <w:rPr>
+          <w:rFonts w:eastAsiaTheme="minorEastAsia"/>
+        </w:rPr>
+        <w:t>.</w:t>
+      </w:r>
+      <w:r>
+        <w:rPr>
+          <w:rFonts w:ascii="Aptos" w:eastAsiaTheme="minorEastAsia" w:hAnsi="Aptos" w:cs="Aptos"/>
+        </w:rPr>
+        <w:t>д</w:t>
+      </w:r>
+      <w:r>
+        <w:rPr>
+          <w:rFonts w:eastAsiaTheme="minorEastAsia"/>
+        </w:rPr>
+        <w:t>.</w:t>
+      </w:r>
+      <w:proofErr w:type="gramEnd"/>
+      <w:r>
+        <w:rPr>
+          <w:rFonts w:eastAsiaTheme="minorEastAsia"/>
+        </w:rPr>
+        <w:t>).</w:t>
+      </w:r>
+    </w:p>
+    <w:p>
+      <w:pPr>
+        <w:spacing w:line="240" w:lineRule="auto"/>
+        <w:rPr>
+          <w:rFonts w:eastAsiaTheme="minorEastAsia"/>
+        </w:rPr>
+      </w:pPr>
+    </w:p>
+    <w:p>
+      <w:pPr>
+        <w:spacing w:line="240" w:lineRule="auto"/>
+        <w:rPr>
+          <w:rFonts w:eastAsiaTheme="minorEastAsia"/>
+        </w:rPr>
+      </w:pPr>
+      <w:r>
+        <w:rPr>
+          <w:rFonts w:eastAsiaTheme="minorEastAsia"/>
+        </w:rPr>
+        <w:t>Важное примечание: В промежуточных циклах оптимизации (например, в конце цикла 1) программа временно показывала отрицательные (мнимые) частоты. Это нормально для начальных стадий оптимизации, когда геометрия еще далека от равновесной. Однако в финальном цикле все частоты стали положительными, что подтверждает, что молекула действительно достигла минимума на поверхности потенциальной энергии и является устойчивой.</w:t>
+      </w:r>
+    </w:p>
+    <w:p>
+      <w:pPr>
+        <w:spacing w:line="240" w:lineRule="auto"/>
+        <w:rPr>
+          <w:rFonts w:eastAsiaTheme="minorEastAsia"/>
+        </w:rPr>
+      </w:pPr>
+    </w:p>
+    <w:p>
+      <w:pPr>
+        <w:spacing w:line="240" w:lineRule="auto"/>
         <w:rPr>
           <w:rFonts w:eastAsiaTheme="minorEastAsia"/>
           <w:lang w:val="en-US"/>
         </w:rPr>
-        <w:t>K</w:t>
-      </w:r>
-      <w:r>
-        <w:rPr>
-          <w:rFonts w:eastAsiaTheme="minorEastAsia"/>
-        </w:rPr>
-        <w:t xml:space="preserve"> равна</w:t>
-      </w:r>
-      <w:r>
+      </w:pPr>
+    </w:p>
+    <w:p>
+      <w:pPr>
+        <w:spacing w:line="240" w:lineRule="auto"/>
         <w:rPr>
           <w:rFonts w:eastAsiaTheme="minorEastAsia"/>
           <w:lang w:val="en-US"/>
         </w:rPr>
-        <w:t> </w:t>
-      </w:r>
-      <w:r>
-        <w:rPr>
-          <w:rFonts w:eastAsiaTheme="minorEastAsia"/>
-        </w:rPr>
-        <w:t xml:space="preserve">-241.75364419 </w:t>
-      </w:r>
-      <w:r>
+      </w:pPr>
+    </w:p>
+    <w:p>
+      <w:pPr>
+        <w:spacing w:line="240" w:lineRule="auto"/>
         <w:rPr>
           <w:rFonts w:eastAsiaTheme="minorEastAsia"/>
           <w:lang w:val="en-US"/>
         </w:rPr>
-        <w:t>Eh</w:t>
-      </w:r>
-      <w:r>
-        <w:rPr>
-          <w:rFonts w:eastAsiaTheme="minorEastAsia"/>
-        </w:rPr>
-        <w:t>, а энергия Гиббса равна</w:t>
-      </w:r>
-      <w:r>
+      </w:pPr>
+    </w:p>
+    <w:p>
+      <w:pPr>
+        <w:spacing w:line="240" w:lineRule="auto"/>
         <w:rPr>
           <w:rFonts w:eastAsiaTheme="minorEastAsia"/>
           <w:lang w:val="en-US"/>
         </w:rPr>
-        <w:t> </w:t>
-      </w:r>
-      <w:r>
-        <w:rPr>
-          <w:rFonts w:eastAsiaTheme="minorEastAsia"/>
-        </w:rPr>
-        <w:t xml:space="preserve">-241.78374321 </w:t>
-      </w:r>
-      <w:r>
+      </w:pPr>
+    </w:p>
+    <w:p>
+      <w:pPr>
+        <w:spacing w:line="240" w:lineRule="auto"/>
+        <w:rPr>
+          <w:rFonts w:eastAsiaTheme="minorEastAsia"/>
+        </w:rPr>
+      </w:pPr>
+      <w:r>
+        <w:rPr>
+          <w:rFonts w:eastAsiaTheme="minorEastAsia"/>
+        </w:rPr>
+        <w:lastRenderedPageBreak/>
+        <w:t>Итоговая геометрия</w:t>
+      </w:r>
+    </w:p>
+    <w:p>
+      <w:pPr>
+        <w:spacing w:line="240" w:lineRule="auto"/>
+        <w:rPr>
+          <w:rFonts w:eastAsiaTheme="minorEastAsia"/>
+        </w:rPr>
+      </w:pPr>
+    </w:p>
+    <w:p>
+      <w:pPr>
+        <w:spacing w:line="240" w:lineRule="auto"/>
+        <w:rPr>
+          <w:rFonts w:eastAsiaTheme="minorEastAsia"/>
+        </w:rPr>
+      </w:pPr>
+      <w:r>
+        <w:rPr>
+          <w:rFonts w:eastAsiaTheme="minorEastAsia"/>
+        </w:rPr>
+        <w:t>Координаты оптимизированной структуры в ангстремах (`CARTESIAN COORDINATES` в конце файла):</w:t>
+      </w:r>
+    </w:p>
+    <w:p>
+      <w:pPr>
+        <w:spacing w:line="240" w:lineRule="auto"/>
+        <w:rPr>
+          <w:rFonts w:eastAsiaTheme="minorEastAsia"/>
+        </w:rPr>
+      </w:pPr>
+    </w:p>
+    <w:p>
+      <w:pPr>
+        <w:spacing w:line="240" w:lineRule="auto"/>
+        <w:rPr>
+          <w:rFonts w:eastAsiaTheme="minorEastAsia"/>
+        </w:rPr>
+      </w:pPr>
+      <w:r>
+        <w:rPr>
+          <w:rFonts w:eastAsiaTheme="minorEastAsia"/>
+        </w:rPr>
+        <w:t>N      0.263070    1.378044    0.000524</w:t>
+      </w:r>
+    </w:p>
+    <w:p>
+      <w:pPr>
+        <w:spacing w:line="240" w:lineRule="auto"/>
+        <w:rPr>
+          <w:rFonts w:eastAsiaTheme="minorEastAsia"/>
+        </w:rPr>
+      </w:pPr>
+      <w:r>
+        <w:rPr>
+          <w:rFonts w:eastAsiaTheme="minorEastAsia"/>
+        </w:rPr>
+        <w:t>N      1.521010    1.186017    0.003361</w:t>
+      </w:r>
+    </w:p>
+    <w:p>
+      <w:pPr>
+        <w:spacing w:line="240" w:lineRule="auto"/>
+        <w:rPr>
+          <w:rFonts w:eastAsiaTheme="minorEastAsia"/>
+        </w:rPr>
+      </w:pPr>
+      <w:r>
+        <w:rPr>
+          <w:rFonts w:eastAsiaTheme="minorEastAsia"/>
+        </w:rPr>
+        <w:t>N     -0.616524    0.370345   -0.001275</w:t>
+      </w:r>
+    </w:p>
+    <w:p>
+      <w:pPr>
+        <w:spacing w:line="240" w:lineRule="auto"/>
+        <w:rPr>
+          <w:rFonts w:eastAsiaTheme="minorEastAsia"/>
+        </w:rPr>
+      </w:pPr>
+      <w:r>
+        <w:rPr>
+          <w:rFonts w:eastAsiaTheme="minorEastAsia"/>
+        </w:rPr>
+        <w:t>C     -0.246565   -0.922251   -0.000642</w:t>
+      </w:r>
+    </w:p>
+    <w:p>
+      <w:pPr>
+        <w:spacing w:line="240" w:lineRule="auto"/>
+        <w:rPr>
+          <w:rFonts w:eastAsiaTheme="minorEastAsia"/>
+        </w:rPr>
+      </w:pPr>
+      <w:r>
+        <w:rPr>
+          <w:rFonts w:eastAsiaTheme="minorEastAsia"/>
+        </w:rPr>
+        <w:t>C      0.100755   -2.121936   -0.003986</w:t>
+      </w:r>
+    </w:p>
+    <w:p>
+      <w:pPr>
+        <w:spacing w:line="240" w:lineRule="auto"/>
+        <w:rPr>
+          <w:rFonts w:eastAsiaTheme="minorEastAsia"/>
+        </w:rPr>
+      </w:pPr>
+      <w:r>
+        <w:rPr>
+          <w:rFonts w:eastAsiaTheme="minorEastAsia"/>
+        </w:rPr>
+        <w:t>H     -0.185935    2.310044   -0.000406</w:t>
+      </w:r>
+    </w:p>
+    <w:p>
+      <w:pPr>
+        <w:spacing w:line="240" w:lineRule="auto"/>
+        <w:rPr>
+          <w:rFonts w:eastAsiaTheme="minorEastAsia"/>
+        </w:rPr>
+      </w:pPr>
+      <w:r>
+        <w:rPr>
+          <w:rFonts w:eastAsiaTheme="minorEastAsia"/>
+        </w:rPr>
+        <w:t>H      1.956492    2.119303    0.004316</w:t>
+      </w:r>
+    </w:p>
+    <w:p>
+      <w:pPr>
+        <w:spacing w:line="240" w:lineRule="auto"/>
         <w:rPr>
           <w:rFonts w:eastAsiaTheme="minorEastAsia"/>
           <w:lang w:val="en-US"/>
         </w:rPr>
-        <w:t>Eh</w:t>
-      </w:r>
-      <w:r>
-        <w:rPr>
-          <w:rFonts w:eastAsiaTheme="minorEastAsia"/>
-        </w:rPr>
-        <w:t>.</w:t>
-      </w:r>
-    </w:p>
-    <w:p>
-      <w:pPr>
-        <w:rPr>
-          <w:rFonts w:eastAsiaTheme="minorEastAsia"/>
-        </w:rPr>
-      </w:pPr>
-    </w:p>
-    <w:p>
-      <w:pPr>
-        <w:spacing w:line="240" w:lineRule="auto"/>
-        <w:rPr>
-          <w:rFonts w:eastAsiaTheme="minorEastAsia"/>
-          <w:lang w:val="en-US"/>
-        </w:rPr>
-      </w:pPr>
-      <w:r>
-        <w:rPr>
-          <w:rFonts w:eastAsiaTheme="minorEastAsia"/>
-          <w:lang w:val="en-US"/>
-        </w:rPr>
-        <w:t>-----------------------</w:t>
-      </w:r>
-    </w:p>
-    <w:p>
-      <w:pPr>
-        <w:spacing w:line="240" w:lineRule="auto"/>
-        <w:rPr>
-          <w:rFonts w:eastAsiaTheme="minorEastAsia"/>
-          <w:lang w:val="en-US"/>
-        </w:rPr>
-      </w:pPr>
-      <w:r>
-        <w:rPr>
-          <w:rFonts w:eastAsiaTheme="minorEastAsia"/>
-          <w:lang w:val="en-US"/>
-        </w:rPr>
-        <w:t>VIBRATIONAL FREQUENCIES</w:t>
-      </w:r>
-    </w:p>
-    <w:p>
-      <w:pPr>
-        <w:spacing w:line="240" w:lineRule="auto"/>
-        <w:rPr>
-          <w:rFonts w:eastAsiaTheme="minorEastAsia"/>
-        </w:rPr>
-      </w:pPr>
-      <w:r>
-        <w:rPr>
-          <w:rFonts w:eastAsiaTheme="minorEastAsia"/>
-          <w:lang w:val="en-US"/>
-        </w:rPr>
-        <w:t>-----------------------</w:t>
-      </w:r>
-    </w:p>
-    <w:p>
-      <w:pPr>
-        <w:spacing w:line="240" w:lineRule="auto"/>
-        <w:rPr>
-          <w:rFonts w:eastAsiaTheme="minorEastAsia"/>
-          <w:lang w:val="en-US"/>
-        </w:rPr>
-      </w:pPr>
-      <w:r>
-        <w:rPr>
-          <w:rFonts w:eastAsiaTheme="minorEastAsia"/>
-          <w:lang w:val="en-US"/>
-        </w:rPr>
-        <w:t xml:space="preserve">Scaling factor for frequencies </w:t>
-      </w:r>
-      <w:proofErr w:type="gramStart"/>
-      <w:r>
-        <w:rPr>
-          <w:rFonts w:eastAsiaTheme="minorEastAsia"/>
-          <w:lang w:val="en-US"/>
-        </w:rPr>
-        <w:t>=  1.000000000</w:t>
-      </w:r>
-      <w:proofErr w:type="gramEnd"/>
-      <w:r>
-        <w:rPr>
-          <w:rFonts w:eastAsiaTheme="minorEastAsia"/>
-          <w:lang w:val="en-US"/>
-        </w:rPr>
-        <w:t xml:space="preserve">  (already applied!)</w:t>
-      </w:r>
-    </w:p>
-    <w:p>
-      <w:pPr>
-        <w:spacing w:line="240" w:lineRule="auto"/>
-        <w:rPr>
-          <w:rFonts w:eastAsiaTheme="minorEastAsia"/>
-          <w:lang w:val="en-US"/>
-        </w:rPr>
-      </w:pPr>
-      <w:r>
-        <w:rPr>
-          <w:rFonts w:eastAsiaTheme="minorEastAsia"/>
-          <w:lang w:val="en-US"/>
-        </w:rPr>
-        <w:t xml:space="preserve">     0:       0.00 cm**-1</w:t>
-      </w:r>
-    </w:p>
-    <w:p>
-      <w:pPr>
-        <w:spacing w:line="240" w:lineRule="auto"/>
-        <w:rPr>
-          <w:rFonts w:eastAsiaTheme="minorEastAsia"/>
-          <w:lang w:val="en-US"/>
-        </w:rPr>
-      </w:pPr>
-      <w:r>
-        <w:rPr>
-          <w:rFonts w:eastAsiaTheme="minorEastAsia"/>
-          <w:lang w:val="en-US"/>
-        </w:rPr>
-        <w:t xml:space="preserve">     1:       0.00 cm**-1</w:t>
-      </w:r>
-    </w:p>
-    <w:p>
-      <w:pPr>
-        <w:spacing w:line="240" w:lineRule="auto"/>
-        <w:rPr>
-          <w:rFonts w:eastAsiaTheme="minorEastAsia"/>
-          <w:lang w:val="en-US"/>
-        </w:rPr>
-      </w:pPr>
-      <w:r>
-        <w:rPr>
-          <w:rFonts w:eastAsiaTheme="minorEastAsia"/>
-          <w:lang w:val="en-US"/>
-        </w:rPr>
-        <w:t xml:space="preserve">     2:       0.00 cm**-1</w:t>
-      </w:r>
-    </w:p>
-    <w:p>
-      <w:pPr>
-        <w:spacing w:line="240" w:lineRule="auto"/>
-        <w:rPr>
-          <w:rFonts w:eastAsiaTheme="minorEastAsia"/>
-          <w:lang w:val="en-US"/>
-        </w:rPr>
-      </w:pPr>
-      <w:r>
-        <w:rPr>
-          <w:rFonts w:eastAsiaTheme="minorEastAsia"/>
-          <w:lang w:val="en-US"/>
-        </w:rPr>
-        <w:t xml:space="preserve">     3:       0.00 cm**-1</w:t>
-      </w:r>
-    </w:p>
-    <w:p>
-      <w:pPr>
-        <w:spacing w:line="240" w:lineRule="auto"/>
-        <w:rPr>
-          <w:rFonts w:eastAsiaTheme="minorEastAsia"/>
-          <w:lang w:val="en-US"/>
-        </w:rPr>
-      </w:pPr>
-      <w:r>
-        <w:rPr>
-          <w:rFonts w:eastAsiaTheme="minorEastAsia"/>
-          <w:lang w:val="en-US"/>
-        </w:rPr>
-        <w:t xml:space="preserve">     4:       0.00 cm**-1</w:t>
-      </w:r>
-    </w:p>
-    <w:p>
-      <w:pPr>
-        <w:spacing w:line="240" w:lineRule="auto"/>
-        <w:rPr>
-          <w:rFonts w:eastAsiaTheme="minorEastAsia"/>
-          <w:lang w:val="en-US"/>
-        </w:rPr>
-      </w:pPr>
-      <w:r>
-        <w:rPr>
-          <w:rFonts w:eastAsiaTheme="minorEastAsia"/>
-          <w:lang w:val="en-US"/>
-        </w:rPr>
-        <w:t xml:space="preserve">     5:       0.00 cm**-1</w:t>
-      </w:r>
-    </w:p>
-    <w:p>
-      <w:pPr>
-        <w:spacing w:line="240" w:lineRule="auto"/>
-        <w:rPr>
-          <w:rFonts w:eastAsiaTheme="minorEastAsia"/>
-          <w:lang w:val="en-US"/>
-        </w:rPr>
-      </w:pPr>
-      <w:r>
-        <w:rPr>
-          <w:rFonts w:eastAsiaTheme="minorEastAsia"/>
-          <w:lang w:val="en-US"/>
-        </w:rPr>
-        <w:t xml:space="preserve">     6:     152.67 cm**-1</w:t>
-      </w:r>
-    </w:p>
-    <w:p>
-      <w:pPr>
-        <w:spacing w:line="240" w:lineRule="auto"/>
-        <w:rPr>
-          <w:rFonts w:eastAsiaTheme="minorEastAsia"/>
-          <w:lang w:val="en-US"/>
-        </w:rPr>
-      </w:pPr>
-      <w:r>
-        <w:rPr>
-          <w:rFonts w:eastAsiaTheme="minorEastAsia"/>
-          <w:lang w:val="en-US"/>
-        </w:rPr>
-        <w:t xml:space="preserve">     7:     257.78 cm**-1</w:t>
-      </w:r>
-    </w:p>
-    <w:p>
-      <w:pPr>
-        <w:spacing w:line="240" w:lineRule="auto"/>
-        <w:rPr>
-          <w:rFonts w:eastAsiaTheme="minorEastAsia"/>
-          <w:lang w:val="en-US"/>
-        </w:rPr>
-      </w:pPr>
-      <w:r>
-        <w:rPr>
-          <w:rFonts w:eastAsiaTheme="minorEastAsia"/>
-          <w:lang w:val="en-US"/>
-        </w:rPr>
-        <w:t xml:space="preserve">     8:     390.50 cm**-1</w:t>
-      </w:r>
-    </w:p>
-    <w:p>
-      <w:pPr>
-        <w:spacing w:line="240" w:lineRule="auto"/>
-        <w:rPr>
-          <w:rFonts w:eastAsiaTheme="minorEastAsia"/>
-          <w:lang w:val="en-US"/>
-        </w:rPr>
-      </w:pPr>
-      <w:r>
-        <w:rPr>
-          <w:rFonts w:eastAsiaTheme="minorEastAsia"/>
-          <w:lang w:val="en-US"/>
-        </w:rPr>
-        <w:t xml:space="preserve">     9:     426.40 cm**-1</w:t>
-      </w:r>
-    </w:p>
-    <w:p>
-      <w:pPr>
-        <w:spacing w:line="240" w:lineRule="auto"/>
-        <w:rPr>
-          <w:rFonts w:eastAsiaTheme="minorEastAsia"/>
-          <w:lang w:val="en-US"/>
-        </w:rPr>
-      </w:pPr>
-      <w:r>
-        <w:rPr>
-          <w:rFonts w:eastAsiaTheme="minorEastAsia"/>
-          <w:lang w:val="en-US"/>
-        </w:rPr>
-        <w:t xml:space="preserve">    10:     466.08 cm**-1</w:t>
-      </w:r>
-    </w:p>
-    <w:p>
-      <w:pPr>
-        <w:spacing w:line="240" w:lineRule="auto"/>
-        <w:rPr>
-          <w:rFonts w:eastAsiaTheme="minorEastAsia"/>
-          <w:lang w:val="en-US"/>
-        </w:rPr>
-      </w:pPr>
-      <w:r>
-        <w:rPr>
-          <w:rFonts w:eastAsiaTheme="minorEastAsia"/>
-          <w:lang w:val="en-US"/>
-        </w:rPr>
-        <w:t xml:space="preserve">    11:     702.46 cm**-1</w:t>
-      </w:r>
-    </w:p>
-    <w:p>
-      <w:pPr>
-        <w:spacing w:line="240" w:lineRule="auto"/>
-        <w:rPr>
-          <w:rFonts w:eastAsiaTheme="minorEastAsia"/>
-          <w:lang w:val="en-US"/>
-        </w:rPr>
-      </w:pPr>
-      <w:r>
-        <w:rPr>
-          <w:rFonts w:eastAsiaTheme="minorEastAsia"/>
-          <w:lang w:val="en-US"/>
-        </w:rPr>
-        <w:t xml:space="preserve">    12:     765.88 cm**-1</w:t>
-      </w:r>
-    </w:p>
-    <w:p>
-      <w:pPr>
-        <w:spacing w:line="240" w:lineRule="auto"/>
-        <w:rPr>
-          <w:rFonts w:eastAsiaTheme="minorEastAsia"/>
-          <w:lang w:val="en-US"/>
-        </w:rPr>
-      </w:pPr>
-      <w:r>
-        <w:rPr>
-          <w:rFonts w:eastAsiaTheme="minorEastAsia"/>
-          <w:lang w:val="en-US"/>
-        </w:rPr>
-        <w:t xml:space="preserve">    13:     897.54 cm**-1</w:t>
-      </w:r>
-    </w:p>
-    <w:p>
-      <w:pPr>
-        <w:spacing w:line="240" w:lineRule="auto"/>
-        <w:rPr>
-          <w:rFonts w:eastAsiaTheme="minorEastAsia"/>
-          <w:lang w:val="en-US"/>
-        </w:rPr>
-      </w:pPr>
-      <w:r>
-        <w:rPr>
-          <w:rFonts w:eastAsiaTheme="minorEastAsia"/>
-          <w:lang w:val="en-US"/>
-        </w:rPr>
-        <w:t xml:space="preserve">    14:     969.33 cm**-1</w:t>
-      </w:r>
-    </w:p>
-    <w:p>
-      <w:pPr>
-        <w:spacing w:line="240" w:lineRule="auto"/>
-        <w:rPr>
-          <w:rFonts w:eastAsiaTheme="minorEastAsia"/>
-          <w:lang w:val="en-US"/>
-        </w:rPr>
-      </w:pPr>
-      <w:r>
-        <w:rPr>
-          <w:rFonts w:eastAsiaTheme="minorEastAsia"/>
-          <w:lang w:val="en-US"/>
-        </w:rPr>
-        <w:t xml:space="preserve">    15:    1137.33 cm**-1</w:t>
-      </w:r>
-    </w:p>
-    <w:p>
-      <w:pPr>
-        <w:spacing w:line="240" w:lineRule="auto"/>
-        <w:rPr>
-          <w:rFonts w:eastAsiaTheme="minorEastAsia"/>
-          <w:lang w:val="en-US"/>
-        </w:rPr>
-      </w:pPr>
-      <w:r>
-        <w:rPr>
-          <w:rFonts w:eastAsiaTheme="minorEastAsia"/>
-          <w:lang w:val="en-US"/>
-        </w:rPr>
-        <w:t xml:space="preserve">    16:    1306.84 cm**-1</w:t>
-      </w:r>
-    </w:p>
-    <w:p>
-      <w:pPr>
-        <w:spacing w:line="240" w:lineRule="auto"/>
-        <w:rPr>
-          <w:rFonts w:eastAsiaTheme="minorEastAsia"/>
-          <w:lang w:val="en-US"/>
-        </w:rPr>
-      </w:pPr>
-      <w:r>
-        <w:rPr>
-          <w:rFonts w:eastAsiaTheme="minorEastAsia"/>
-          <w:lang w:val="en-US"/>
-        </w:rPr>
-        <w:t xml:space="preserve">    17:    1371.40 cm**-1</w:t>
-      </w:r>
-    </w:p>
-    <w:p>
-      <w:pPr>
-        <w:spacing w:line="240" w:lineRule="auto"/>
-        <w:rPr>
-          <w:rFonts w:eastAsiaTheme="minorEastAsia"/>
-          <w:lang w:val="en-US"/>
-        </w:rPr>
-      </w:pPr>
-      <w:r>
-        <w:rPr>
-          <w:rFonts w:eastAsiaTheme="minorEastAsia"/>
-          <w:lang w:val="en-US"/>
-        </w:rPr>
-        <w:t xml:space="preserve">    18:    1499.38 cm**-1</w:t>
-      </w:r>
-    </w:p>
-    <w:p>
-      <w:pPr>
-        <w:spacing w:line="240" w:lineRule="auto"/>
-        <w:rPr>
-          <w:rFonts w:eastAsiaTheme="minorEastAsia"/>
-          <w:lang w:val="en-US"/>
-        </w:rPr>
-      </w:pPr>
-      <w:r>
-        <w:rPr>
-          <w:rFonts w:eastAsiaTheme="minorEastAsia"/>
-          <w:lang w:val="en-US"/>
-        </w:rPr>
-        <w:t xml:space="preserve">    19:    1589.93 cm**-1</w:t>
-      </w:r>
-    </w:p>
-    <w:p>
-      <w:pPr>
-        <w:spacing w:line="240" w:lineRule="auto"/>
-        <w:rPr>
-          <w:rFonts w:eastAsiaTheme="minorEastAsia"/>
-        </w:rPr>
-      </w:pPr>
-      <w:r>
-        <w:rPr>
-          <w:rFonts w:eastAsiaTheme="minorEastAsia"/>
-          <w:lang w:val="en-US"/>
-        </w:rPr>
-        <w:t xml:space="preserve">    </w:t>
-      </w:r>
-      <w:proofErr w:type="gramStart"/>
-      <w:r>
-        <w:rPr>
-          <w:rFonts w:eastAsiaTheme="minorEastAsia"/>
-        </w:rPr>
-        <w:t xml:space="preserve">20:   </w:t>
-      </w:r>
-      <w:proofErr w:type="gramEnd"/>
-      <w:r>
-        <w:rPr>
-          <w:rFonts w:eastAsiaTheme="minorEastAsia"/>
-        </w:rPr>
-        <w:t xml:space="preserve"> 2017.20 </w:t>
-      </w:r>
-      <w:proofErr w:type="spellStart"/>
-      <w:r>
-        <w:rPr>
-          <w:rFonts w:eastAsiaTheme="minorEastAsia"/>
-        </w:rPr>
-        <w:t>cm</w:t>
-      </w:r>
-      <w:proofErr w:type="spellEnd"/>
-      <w:r>
-        <w:rPr>
-          <w:rFonts w:eastAsiaTheme="minorEastAsia"/>
-        </w:rPr>
-        <w:t>**-1</w:t>
-      </w:r>
-    </w:p>
-    <w:p>
-      <w:pPr>
-        <w:spacing w:line="240" w:lineRule="auto"/>
-        <w:rPr>
-          <w:rFonts w:eastAsiaTheme="minorEastAsia"/>
-        </w:rPr>
-      </w:pPr>
-      <w:r>
-        <w:rPr>
-          <w:rFonts w:eastAsiaTheme="minorEastAsia"/>
-        </w:rPr>
-        <w:t xml:space="preserve">    </w:t>
-      </w:r>
-      <w:proofErr w:type="gramStart"/>
-      <w:r>
-        <w:rPr>
-          <w:rFonts w:eastAsiaTheme="minorEastAsia"/>
-        </w:rPr>
-        <w:t xml:space="preserve">21:   </w:t>
-      </w:r>
-      <w:proofErr w:type="gramEnd"/>
-      <w:r>
-        <w:rPr>
-          <w:rFonts w:eastAsiaTheme="minorEastAsia"/>
-        </w:rPr>
-        <w:t xml:space="preserve"> 3296.93 </w:t>
-      </w:r>
-      <w:proofErr w:type="spellStart"/>
-      <w:r>
-        <w:rPr>
-          <w:rFonts w:eastAsiaTheme="minorEastAsia"/>
-        </w:rPr>
-        <w:t>cm</w:t>
-      </w:r>
-      <w:proofErr w:type="spellEnd"/>
-      <w:r>
-        <w:rPr>
-          <w:rFonts w:eastAsiaTheme="minorEastAsia"/>
-        </w:rPr>
-        <w:t>**-1</w:t>
-      </w:r>
-    </w:p>
-    <w:p>
-      <w:pPr>
-        <w:spacing w:line="240" w:lineRule="auto"/>
-        <w:rPr>
-          <w:rFonts w:eastAsiaTheme="minorEastAsia"/>
-        </w:rPr>
-      </w:pPr>
-      <w:r>
-        <w:rPr>
-          <w:rFonts w:eastAsiaTheme="minorEastAsia"/>
-        </w:rPr>
-        <w:t xml:space="preserve">    </w:t>
-      </w:r>
-      <w:proofErr w:type="gramStart"/>
-      <w:r>
-        <w:rPr>
-          <w:rFonts w:eastAsiaTheme="minorEastAsia"/>
-        </w:rPr>
-        <w:t xml:space="preserve">22:   </w:t>
-      </w:r>
-      <w:proofErr w:type="gramEnd"/>
-      <w:r>
-        <w:rPr>
-          <w:rFonts w:eastAsiaTheme="minorEastAsia"/>
-        </w:rPr>
-        <w:t xml:space="preserve"> 3350.20 </w:t>
-      </w:r>
-      <w:proofErr w:type="spellStart"/>
-      <w:r>
-        <w:rPr>
-          <w:rFonts w:eastAsiaTheme="minorEastAsia"/>
-        </w:rPr>
-        <w:t>cm</w:t>
-      </w:r>
-      <w:proofErr w:type="spellEnd"/>
-      <w:r>
-        <w:rPr>
-          <w:rFonts w:eastAsiaTheme="minorEastAsia"/>
-        </w:rPr>
-        <w:t>**-1</w:t>
-      </w:r>
-    </w:p>
-    <w:p>
-      <w:pPr>
-        <w:spacing w:line="240" w:lineRule="auto"/>
-        <w:rPr>
-          <w:rFonts w:eastAsiaTheme="minorEastAsia"/>
-        </w:rPr>
-      </w:pPr>
-      <w:r>
-        <w:rPr>
-          <w:rFonts w:eastAsiaTheme="minorEastAsia"/>
-        </w:rPr>
-        <w:t xml:space="preserve">    </w:t>
-      </w:r>
-      <w:proofErr w:type="gramStart"/>
-      <w:r>
-        <w:rPr>
-          <w:rFonts w:eastAsiaTheme="minorEastAsia"/>
-        </w:rPr>
-        <w:t xml:space="preserve">23:   </w:t>
-      </w:r>
-      <w:proofErr w:type="gramEnd"/>
-      <w:r>
-        <w:rPr>
-          <w:rFonts w:eastAsiaTheme="minorEastAsia"/>
-        </w:rPr>
-        <w:t xml:space="preserve"> 3410.12 </w:t>
-      </w:r>
-      <w:proofErr w:type="spellStart"/>
-      <w:r>
-        <w:rPr>
-          <w:rFonts w:eastAsiaTheme="minorEastAsia"/>
-        </w:rPr>
-        <w:t>cm</w:t>
-      </w:r>
-      <w:proofErr w:type="spellEnd"/>
-      <w:r>
-        <w:rPr>
-          <w:rFonts w:eastAsiaTheme="minorEastAsia"/>
-        </w:rPr>
-        <w:t>**-1</w:t>
+      </w:pPr>
+      <w:r>
+        <w:rPr>
+          <w:rFonts w:eastAsiaTheme="minorEastAsia"/>
+        </w:rPr>
+        <w:t>H     -1.592304    0.680434   -0.001891</w:t>
       </w:r>
     </w:p>
     <w:sectPr>
@@ -2878,6 +2836,119 @@
     </w:lvl>
   </w:abstractNum>
   <w:abstractNum w:abstractNumId="8" w15:restartNumberingAfterBreak="0">
+    <w:nsid w:val="478D1CB8"/>
+    <w:multiLevelType w:val="hybridMultilevel"/>
+    <w:tmpl w:val="D61C8FDE"/>
+    <w:lvl w:ilvl="0" w:tplc="04190001">
+      <w:start w:val="1"/>
+      <w:numFmt w:val="bullet"/>
+      <w:lvlText w:val=""/>
+      <w:lvlJc w:val="left"/>
+      <w:pPr>
+        <w:ind w:left="720" w:hanging="360"/>
+      </w:pPr>
+      <w:rPr>
+        <w:rFonts w:ascii="Symbol" w:hAnsi="Symbol" w:hint="default"/>
+      </w:rPr>
+    </w:lvl>
+    <w:lvl w:ilvl="1" w:tplc="04190003" w:tentative="1">
+      <w:start w:val="1"/>
+      <w:numFmt w:val="bullet"/>
+      <w:lvlText w:val="o"/>
+      <w:lvlJc w:val="left"/>
+      <w:pPr>
+        <w:ind w:left="1440" w:hanging="360"/>
+      </w:pPr>
+      <w:rPr>
+        <w:rFonts w:ascii="Courier New" w:hAnsi="Courier New" w:cs="Courier New" w:hint="default"/>
+      </w:rPr>
+    </w:lvl>
+    <w:lvl w:ilvl="2" w:tplc="04190005" w:tentative="1">
+      <w:start w:val="1"/>
+      <w:numFmt w:val="bullet"/>
+      <w:lvlText w:val=""/>
+      <w:lvlJc w:val="left"/>
+      <w:pPr>
+        <w:ind w:left="2160" w:hanging="360"/>
+      </w:pPr>
+      <w:rPr>
+        <w:rFonts w:ascii="Wingdings" w:hAnsi="Wingdings" w:hint="default"/>
+      </w:rPr>
+    </w:lvl>
+    <w:lvl w:ilvl="3" w:tplc="04190001" w:tentative="1">
+      <w:start w:val="1"/>
+      <w:numFmt w:val="bullet"/>
+      <w:lvlText w:val=""/>
+      <w:lvlJc w:val="left"/>
+      <w:pPr>
+        <w:ind w:left="2880" w:hanging="360"/>
+      </w:pPr>
+      <w:rPr>
+        <w:rFonts w:ascii="Symbol" w:hAnsi="Symbol" w:hint="default"/>
+      </w:rPr>
+    </w:lvl>
+    <w:lvl w:ilvl="4" w:tplc="04190003" w:tentative="1">
+      <w:start w:val="1"/>
+      <w:numFmt w:val="bullet"/>
+      <w:lvlText w:val="o"/>
+      <w:lvlJc w:val="left"/>
+      <w:pPr>
+        <w:ind w:left="3600" w:hanging="360"/>
+      </w:pPr>
+      <w:rPr>
+        <w:rFonts w:ascii="Courier New" w:hAnsi="Courier New" w:cs="Courier New" w:hint="default"/>
+      </w:rPr>
+    </w:lvl>
+    <w:lvl w:ilvl="5" w:tplc="04190005" w:tentative="1">
+      <w:start w:val="1"/>
+      <w:numFmt w:val="bullet"/>
+      <w:lvlText w:val=""/>
+      <w:lvlJc w:val="left"/>
+      <w:pPr>
+        <w:ind w:left="4320" w:hanging="360"/>
+      </w:pPr>
+      <w:rPr>
+        <w:rFonts w:ascii="Wingdings" w:hAnsi="Wingdings" w:hint="default"/>
+      </w:rPr>
+    </w:lvl>
+    <w:lvl w:ilvl="6" w:tplc="04190001" w:tentative="1">
+      <w:start w:val="1"/>
+      <w:numFmt w:val="bullet"/>
+      <w:lvlText w:val=""/>
+      <w:lvlJc w:val="left"/>
+      <w:pPr>
+        <w:ind w:left="5040" w:hanging="360"/>
+      </w:pPr>
+      <w:rPr>
+        <w:rFonts w:ascii="Symbol" w:hAnsi="Symbol" w:hint="default"/>
+      </w:rPr>
+    </w:lvl>
+    <w:lvl w:ilvl="7" w:tplc="04190003" w:tentative="1">
+      <w:start w:val="1"/>
+      <w:numFmt w:val="bullet"/>
+      <w:lvlText w:val="o"/>
+      <w:lvlJc w:val="left"/>
+      <w:pPr>
+        <w:ind w:left="5760" w:hanging="360"/>
+      </w:pPr>
+      <w:rPr>
+        <w:rFonts w:ascii="Courier New" w:hAnsi="Courier New" w:cs="Courier New" w:hint="default"/>
+      </w:rPr>
+    </w:lvl>
+    <w:lvl w:ilvl="8" w:tplc="04190005" w:tentative="1">
+      <w:start w:val="1"/>
+      <w:numFmt w:val="bullet"/>
+      <w:lvlText w:val=""/>
+      <w:lvlJc w:val="left"/>
+      <w:pPr>
+        <w:ind w:left="6480" w:hanging="360"/>
+      </w:pPr>
+      <w:rPr>
+        <w:rFonts w:ascii="Wingdings" w:hAnsi="Wingdings" w:hint="default"/>
+      </w:rPr>
+    </w:lvl>
+  </w:abstractNum>
+  <w:abstractNum w:abstractNumId="9" w15:restartNumberingAfterBreak="0">
     <w:nsid w:val="655D6600"/>
     <w:multiLevelType w:val="multilevel"/>
     <w:tmpl w:val="A7FACDDE"/>
@@ -2990,7 +3061,7 @@
       </w:pPr>
     </w:lvl>
   </w:abstractNum>
-  <w:abstractNum w:abstractNumId="9" w15:restartNumberingAfterBreak="0">
+  <w:abstractNum w:abstractNumId="10" w15:restartNumberingAfterBreak="0">
     <w:nsid w:val="7C201B6A"/>
     <w:multiLevelType w:val="multilevel"/>
     <w:tmpl w:val="C3A2B3F6"/>
@@ -3124,13 +3195,13 @@
     </w:lvlOverride>
   </w:num>
   <w:num w:numId="3" w16cid:durableId="921259553">
-    <w:abstractNumId w:val="9"/>
+    <w:abstractNumId w:val="10"/>
   </w:num>
   <w:num w:numId="4" w16cid:durableId="637536458">
     <w:abstractNumId w:val="5"/>
   </w:num>
   <w:num w:numId="5" w16cid:durableId="987368339">
-    <w:abstractNumId w:val="8"/>
+    <w:abstractNumId w:val="9"/>
   </w:num>
   <w:num w:numId="6" w16cid:durableId="759790685">
     <w:abstractNumId w:val="6"/>
@@ -3146,6 +3217,9 @@
   </w:num>
   <w:num w:numId="10" w16cid:durableId="1510635272">
     <w:abstractNumId w:val="3"/>
+  </w:num>
+  <w:num w:numId="11" w16cid:durableId="1485122507">
+    <w:abstractNumId w:val="8"/>
   </w:num>
 </w:numbering>
 </file>
@@ -3753,6 +3827,7 @@
   <w:style w:type="character" w:default="1" w:styleId="a0">
     <w:name w:val="Default Paragraph Font"/>
     <w:uiPriority w:val="1"/>
+    <w:semiHidden/>
     <w:unhideWhenUsed/>
   </w:style>
   <w:style w:type="table" w:default="1" w:styleId="a1">

</xml_diff>